<commit_message>
more calculations + graphic
</commit_message>
<xml_diff>
--- a/lab-2/lab-2.docx
+++ b/lab-2/lab-2.docx
@@ -103,7 +103,26 @@
           <w:sz w:val="32"/>
           <w:szCs w:val="32"/>
         </w:rPr>
-        <w:t>«Параллельная реализация решения СЛАУ с помощью MPI»</w:t>
+        <w:t xml:space="preserve">«Параллельная реализация решения СЛАУ с помощью </w:t>
+      </w:r>
+      <w:r>
+        <w:rPr>
+          <w:b/>
+          <w:bCs/>
+          <w:sz w:val="32"/>
+          <w:szCs w:val="32"/>
+          <w:lang w:val="en-US"/>
+        </w:rPr>
+        <w:t>OpenMP</w:t>
+      </w:r>
+      <w:r>
+        <w:rPr>
+          <w:b/>
+          <w:bCs/>
+          <w:sz w:val="32"/>
+          <w:szCs w:val="32"/>
+        </w:rPr>
+        <w:t>»</w:t>
       </w:r>
     </w:p>
     <w:p>
@@ -241,16 +260,6 @@
         <w:rPr>
           <w:b/>
           <w:bCs/>
-          <w:sz w:val="40"/>
-          <w:szCs w:val="40"/>
-        </w:rPr>
-      </w:pPr>
-    </w:p>
-    <w:p>
-      <w:pPr>
-        <w:rPr>
-          <w:b/>
-          <w:bCs/>
           <w:sz w:val="32"/>
           <w:szCs w:val="32"/>
         </w:rPr>
@@ -281,7 +290,27 @@
           <w:sz w:val="32"/>
           <w:szCs w:val="32"/>
         </w:rPr>
-        <w:t>Преподаватель: Мичуров Михаил Антонович</w:t>
+        <w:t xml:space="preserve">Преподаватель: </w:t>
+      </w:r>
+      <w:proofErr w:type="spellStart"/>
+      <w:r>
+        <w:rPr>
+          <w:b/>
+          <w:bCs/>
+          <w:sz w:val="32"/>
+          <w:szCs w:val="32"/>
+        </w:rPr>
+        <w:t>Мичуров</w:t>
+      </w:r>
+      <w:proofErr w:type="spellEnd"/>
+      <w:r>
+        <w:rPr>
+          <w:b/>
+          <w:bCs/>
+          <w:sz w:val="32"/>
+          <w:szCs w:val="32"/>
+        </w:rPr>
+        <w:t xml:space="preserve"> Михаил Антонович</w:t>
       </w:r>
     </w:p>
     <w:p>
@@ -310,7 +339,6 @@
           <w:szCs w:val="32"/>
           <w:lang w:eastAsia="ru-RU"/>
         </w:rPr>
-        <w:lastRenderedPageBreak/>
         <w:t>ЦЕЛЬ</w:t>
       </w:r>
     </w:p>
@@ -334,7 +362,30 @@
           <w:szCs w:val="27"/>
           <w:lang w:eastAsia="ru-RU"/>
         </w:rPr>
-        <w:t>Параллельная реализация вычислительного алгоритма с использованием OpenMP.</w:t>
+        <w:lastRenderedPageBreak/>
+        <w:t xml:space="preserve">Параллельная реализация вычислительного алгоритма с использованием </w:t>
+      </w:r>
+      <w:proofErr w:type="spellStart"/>
+      <w:r>
+        <w:rPr>
+          <w:rFonts w:ascii="Times New Roman" w:eastAsia="Times New Roman" w:hAnsi="Times New Roman" w:cs="Times New Roman"/>
+          <w:color w:val="000000"/>
+          <w:sz w:val="27"/>
+          <w:szCs w:val="27"/>
+          <w:lang w:eastAsia="ru-RU"/>
+        </w:rPr>
+        <w:t>OpenMP</w:t>
+      </w:r>
+      <w:proofErr w:type="spellEnd"/>
+      <w:r>
+        <w:rPr>
+          <w:rFonts w:ascii="Times New Roman" w:eastAsia="Times New Roman" w:hAnsi="Times New Roman" w:cs="Times New Roman"/>
+          <w:color w:val="000000"/>
+          <w:sz w:val="27"/>
+          <w:szCs w:val="27"/>
+          <w:lang w:eastAsia="ru-RU"/>
+        </w:rPr>
+        <w:t>.</w:t>
       </w:r>
     </w:p>
     <w:p>
@@ -403,7 +454,51 @@
           <w:lang w:eastAsia="ru-RU"/>
         </w:rPr>
         <w:br/>
-        <w:t>Взять последовательную программу решения СЛАУ Ax=b (из ЛР1) и реализовать два варианта распараллеливания с помощью OpenMP:</w:t>
+        <w:t xml:space="preserve">Взять последовательную программу решения СЛАУ </w:t>
+      </w:r>
+      <w:proofErr w:type="spellStart"/>
+      <w:r>
+        <w:rPr>
+          <w:rFonts w:ascii="Times New Roman" w:eastAsia="Times New Roman" w:hAnsi="Times New Roman" w:cs="Times New Roman"/>
+          <w:color w:val="000000"/>
+          <w:sz w:val="27"/>
+          <w:szCs w:val="27"/>
+          <w:lang w:eastAsia="ru-RU"/>
+        </w:rPr>
+        <w:t>Ax</w:t>
+      </w:r>
+      <w:proofErr w:type="spellEnd"/>
+      <w:r>
+        <w:rPr>
+          <w:rFonts w:ascii="Times New Roman" w:eastAsia="Times New Roman" w:hAnsi="Times New Roman" w:cs="Times New Roman"/>
+          <w:color w:val="000000"/>
+          <w:sz w:val="27"/>
+          <w:szCs w:val="27"/>
+          <w:lang w:eastAsia="ru-RU"/>
+        </w:rPr>
+        <w:t xml:space="preserve">=b (из ЛР1) и реализовать два варианта распараллеливания с помощью </w:t>
+      </w:r>
+      <w:proofErr w:type="spellStart"/>
+      <w:r>
+        <w:rPr>
+          <w:rFonts w:ascii="Times New Roman" w:eastAsia="Times New Roman" w:hAnsi="Times New Roman" w:cs="Times New Roman"/>
+          <w:color w:val="000000"/>
+          <w:sz w:val="27"/>
+          <w:szCs w:val="27"/>
+          <w:lang w:eastAsia="ru-RU"/>
+        </w:rPr>
+        <w:t>OpenMP</w:t>
+      </w:r>
+      <w:proofErr w:type="spellEnd"/>
+      <w:r>
+        <w:rPr>
+          <w:rFonts w:ascii="Times New Roman" w:eastAsia="Times New Roman" w:hAnsi="Times New Roman" w:cs="Times New Roman"/>
+          <w:color w:val="000000"/>
+          <w:sz w:val="27"/>
+          <w:szCs w:val="27"/>
+          <w:lang w:eastAsia="ru-RU"/>
+        </w:rPr>
+        <w:t>:</w:t>
       </w:r>
     </w:p>
     <w:p>
@@ -443,7 +538,95 @@
           <w:szCs w:val="27"/>
           <w:lang w:eastAsia="ru-RU"/>
         </w:rPr>
-        <w:t xml:space="preserve"> Каждый вычислительный цикл обрамляется директивой #pragma omp parallel for.</w:t>
+        <w:t xml:space="preserve"> Каждый вычислительный цикл обрамляется директивой #</w:t>
+      </w:r>
+      <w:proofErr w:type="spellStart"/>
+      <w:r>
+        <w:rPr>
+          <w:rFonts w:ascii="Times New Roman" w:eastAsia="Times New Roman" w:hAnsi="Times New Roman" w:cs="Times New Roman"/>
+          <w:color w:val="000000"/>
+          <w:sz w:val="27"/>
+          <w:szCs w:val="27"/>
+          <w:lang w:eastAsia="ru-RU"/>
+        </w:rPr>
+        <w:t>pragma</w:t>
+      </w:r>
+      <w:proofErr w:type="spellEnd"/>
+      <w:r>
+        <w:rPr>
+          <w:rFonts w:ascii="Times New Roman" w:eastAsia="Times New Roman" w:hAnsi="Times New Roman" w:cs="Times New Roman"/>
+          <w:color w:val="000000"/>
+          <w:sz w:val="27"/>
+          <w:szCs w:val="27"/>
+          <w:lang w:eastAsia="ru-RU"/>
+        </w:rPr>
+        <w:t xml:space="preserve"> </w:t>
+      </w:r>
+      <w:proofErr w:type="spellStart"/>
+      <w:r>
+        <w:rPr>
+          <w:rFonts w:ascii="Times New Roman" w:eastAsia="Times New Roman" w:hAnsi="Times New Roman" w:cs="Times New Roman"/>
+          <w:color w:val="000000"/>
+          <w:sz w:val="27"/>
+          <w:szCs w:val="27"/>
+          <w:lang w:eastAsia="ru-RU"/>
+        </w:rPr>
+        <w:t>omp</w:t>
+      </w:r>
+      <w:proofErr w:type="spellEnd"/>
+      <w:r>
+        <w:rPr>
+          <w:rFonts w:ascii="Times New Roman" w:eastAsia="Times New Roman" w:hAnsi="Times New Roman" w:cs="Times New Roman"/>
+          <w:color w:val="000000"/>
+          <w:sz w:val="27"/>
+          <w:szCs w:val="27"/>
+          <w:lang w:eastAsia="ru-RU"/>
+        </w:rPr>
+        <w:t xml:space="preserve"> </w:t>
+      </w:r>
+      <w:proofErr w:type="spellStart"/>
+      <w:r>
+        <w:rPr>
+          <w:rFonts w:ascii="Times New Roman" w:eastAsia="Times New Roman" w:hAnsi="Times New Roman" w:cs="Times New Roman"/>
+          <w:color w:val="000000"/>
+          <w:sz w:val="27"/>
+          <w:szCs w:val="27"/>
+          <w:lang w:eastAsia="ru-RU"/>
+        </w:rPr>
+        <w:t>parallel</w:t>
+      </w:r>
+      <w:proofErr w:type="spellEnd"/>
+      <w:r>
+        <w:rPr>
+          <w:rFonts w:ascii="Times New Roman" w:eastAsia="Times New Roman" w:hAnsi="Times New Roman" w:cs="Times New Roman"/>
+          <w:color w:val="000000"/>
+          <w:sz w:val="27"/>
+          <w:szCs w:val="27"/>
+          <w:lang w:eastAsia="ru-RU"/>
+        </w:rPr>
+        <w:t xml:space="preserve"> </w:t>
+      </w:r>
+      <w:proofErr w:type="spellStart"/>
+      <w:r>
+        <w:rPr>
+          <w:rFonts w:ascii="Times New Roman" w:eastAsia="Times New Roman" w:hAnsi="Times New Roman" w:cs="Times New Roman"/>
+          <w:color w:val="000000"/>
+          <w:sz w:val="27"/>
+          <w:szCs w:val="27"/>
+          <w:lang w:eastAsia="ru-RU"/>
+        </w:rPr>
+        <w:t>for</w:t>
+      </w:r>
+      <w:proofErr w:type="spellEnd"/>
+      <w:r>
+        <w:rPr>
+          <w:rFonts w:ascii="Times New Roman" w:eastAsia="Times New Roman" w:hAnsi="Times New Roman" w:cs="Times New Roman"/>
+          <w:color w:val="000000"/>
+          <w:sz w:val="27"/>
+          <w:szCs w:val="27"/>
+          <w:lang w:eastAsia="ru-RU"/>
+        </w:rPr>
+        <w:t>.</w:t>
       </w:r>
     </w:p>
     <w:p>
@@ -483,7 +666,139 @@
           <w:szCs w:val="27"/>
           <w:lang w:eastAsia="ru-RU"/>
         </w:rPr>
-        <w:t xml:space="preserve"> Одна директива #pragma omp parallel охватывает весь итерационный процесс (включая цикл сходимости), а для распределения работы используются директивы #pragma omp for.</w:t>
+        <w:t xml:space="preserve"> Одна директива #</w:t>
+      </w:r>
+      <w:proofErr w:type="spellStart"/>
+      <w:r>
+        <w:rPr>
+          <w:rFonts w:ascii="Times New Roman" w:eastAsia="Times New Roman" w:hAnsi="Times New Roman" w:cs="Times New Roman"/>
+          <w:color w:val="000000"/>
+          <w:sz w:val="27"/>
+          <w:szCs w:val="27"/>
+          <w:lang w:eastAsia="ru-RU"/>
+        </w:rPr>
+        <w:t>pragma</w:t>
+      </w:r>
+      <w:proofErr w:type="spellEnd"/>
+      <w:r>
+        <w:rPr>
+          <w:rFonts w:ascii="Times New Roman" w:eastAsia="Times New Roman" w:hAnsi="Times New Roman" w:cs="Times New Roman"/>
+          <w:color w:val="000000"/>
+          <w:sz w:val="27"/>
+          <w:szCs w:val="27"/>
+          <w:lang w:eastAsia="ru-RU"/>
+        </w:rPr>
+        <w:t xml:space="preserve"> </w:t>
+      </w:r>
+      <w:proofErr w:type="spellStart"/>
+      <w:r>
+        <w:rPr>
+          <w:rFonts w:ascii="Times New Roman" w:eastAsia="Times New Roman" w:hAnsi="Times New Roman" w:cs="Times New Roman"/>
+          <w:color w:val="000000"/>
+          <w:sz w:val="27"/>
+          <w:szCs w:val="27"/>
+          <w:lang w:eastAsia="ru-RU"/>
+        </w:rPr>
+        <w:t>omp</w:t>
+      </w:r>
+      <w:proofErr w:type="spellEnd"/>
+      <w:r>
+        <w:rPr>
+          <w:rFonts w:ascii="Times New Roman" w:eastAsia="Times New Roman" w:hAnsi="Times New Roman" w:cs="Times New Roman"/>
+          <w:color w:val="000000"/>
+          <w:sz w:val="27"/>
+          <w:szCs w:val="27"/>
+          <w:lang w:eastAsia="ru-RU"/>
+        </w:rPr>
+        <w:t xml:space="preserve"> </w:t>
+      </w:r>
+      <w:proofErr w:type="spellStart"/>
+      <w:r>
+        <w:rPr>
+          <w:rFonts w:ascii="Times New Roman" w:eastAsia="Times New Roman" w:hAnsi="Times New Roman" w:cs="Times New Roman"/>
+          <w:color w:val="000000"/>
+          <w:sz w:val="27"/>
+          <w:szCs w:val="27"/>
+          <w:lang w:eastAsia="ru-RU"/>
+        </w:rPr>
+        <w:t>parallel</w:t>
+      </w:r>
+      <w:proofErr w:type="spellEnd"/>
+      <w:r>
+        <w:rPr>
+          <w:rFonts w:ascii="Times New Roman" w:eastAsia="Times New Roman" w:hAnsi="Times New Roman" w:cs="Times New Roman"/>
+          <w:color w:val="000000"/>
+          <w:sz w:val="27"/>
+          <w:szCs w:val="27"/>
+          <w:lang w:eastAsia="ru-RU"/>
+        </w:rPr>
+        <w:t xml:space="preserve"> охватывает весь итерационный процесс (включая цикл сходимости), а для распределения работы используются директивы #</w:t>
+      </w:r>
+      <w:proofErr w:type="spellStart"/>
+      <w:r>
+        <w:rPr>
+          <w:rFonts w:ascii="Times New Roman" w:eastAsia="Times New Roman" w:hAnsi="Times New Roman" w:cs="Times New Roman"/>
+          <w:color w:val="000000"/>
+          <w:sz w:val="27"/>
+          <w:szCs w:val="27"/>
+          <w:lang w:eastAsia="ru-RU"/>
+        </w:rPr>
+        <w:t>pragma</w:t>
+      </w:r>
+      <w:proofErr w:type="spellEnd"/>
+      <w:r>
+        <w:rPr>
+          <w:rFonts w:ascii="Times New Roman" w:eastAsia="Times New Roman" w:hAnsi="Times New Roman" w:cs="Times New Roman"/>
+          <w:color w:val="000000"/>
+          <w:sz w:val="27"/>
+          <w:szCs w:val="27"/>
+          <w:lang w:eastAsia="ru-RU"/>
+        </w:rPr>
+        <w:t xml:space="preserve"> </w:t>
+      </w:r>
+      <w:proofErr w:type="spellStart"/>
+      <w:r>
+        <w:rPr>
+          <w:rFonts w:ascii="Times New Roman" w:eastAsia="Times New Roman" w:hAnsi="Times New Roman" w:cs="Times New Roman"/>
+          <w:color w:val="000000"/>
+          <w:sz w:val="27"/>
+          <w:szCs w:val="27"/>
+          <w:lang w:eastAsia="ru-RU"/>
+        </w:rPr>
+        <w:t>omp</w:t>
+      </w:r>
+      <w:proofErr w:type="spellEnd"/>
+      <w:r>
+        <w:rPr>
+          <w:rFonts w:ascii="Times New Roman" w:eastAsia="Times New Roman" w:hAnsi="Times New Roman" w:cs="Times New Roman"/>
+          <w:color w:val="000000"/>
+          <w:sz w:val="27"/>
+          <w:szCs w:val="27"/>
+          <w:lang w:eastAsia="ru-RU"/>
+        </w:rPr>
+        <w:t xml:space="preserve"> </w:t>
+      </w:r>
+      <w:proofErr w:type="spellStart"/>
+      <w:r>
+        <w:rPr>
+          <w:rFonts w:ascii="Times New Roman" w:eastAsia="Times New Roman" w:hAnsi="Times New Roman" w:cs="Times New Roman"/>
+          <w:color w:val="000000"/>
+          <w:sz w:val="27"/>
+          <w:szCs w:val="27"/>
+          <w:lang w:eastAsia="ru-RU"/>
+        </w:rPr>
+        <w:t>for</w:t>
+      </w:r>
+      <w:proofErr w:type="spellEnd"/>
+      <w:r>
+        <w:rPr>
+          <w:rFonts w:ascii="Times New Roman" w:eastAsia="Times New Roman" w:hAnsi="Times New Roman" w:cs="Times New Roman"/>
+          <w:color w:val="000000"/>
+          <w:sz w:val="27"/>
+          <w:szCs w:val="27"/>
+          <w:lang w:eastAsia="ru-RU"/>
+        </w:rPr>
+        <w:t>.</w:t>
       </w:r>
     </w:p>
     <w:p>
@@ -513,41 +828,79 @@
           <w:szCs w:val="27"/>
           <w:lang w:eastAsia="ru-RU"/>
         </w:rPr>
-        <w:t>Важно:</w:t>
-      </w:r>
-      <w:r>
-        <w:rPr>
-          <w:rFonts w:ascii="Times New Roman" w:eastAsia="Times New Roman" w:hAnsi="Times New Roman" w:cs="Times New Roman"/>
-          <w:color w:val="000000"/>
-          <w:sz w:val="27"/>
-          <w:szCs w:val="27"/>
-          <w:lang w:eastAsia="ru-RU"/>
-        </w:rPr>
-        <w:t xml:space="preserve"> Обеспечить детерминированный ввод: исходные данные (матрица A и вектор b) должны заполняться одинаково при любом количестве потоков.</w:t>
-      </w:r>
-    </w:p>
-    <w:p>
-      <w:pPr>
-        <w:rPr>
-          <w:rFonts w:ascii="Times New Roman" w:eastAsia="Times New Roman" w:hAnsi="Times New Roman" w:cs="Times New Roman"/>
-          <w:color w:val="000000"/>
-          <w:sz w:val="27"/>
-          <w:szCs w:val="27"/>
-          <w:lang w:eastAsia="ru-RU"/>
-        </w:rPr>
-      </w:pPr>
-      <w:r>
-        <w:rPr>
-          <w:rFonts w:ascii="Times New Roman" w:eastAsia="Times New Roman" w:hAnsi="Times New Roman" w:cs="Times New Roman"/>
-          <w:b/>
-          <w:bCs/>
-          <w:color w:val="000000"/>
-          <w:sz w:val="27"/>
-          <w:szCs w:val="27"/>
-          <w:lang w:eastAsia="ru-RU"/>
-        </w:rPr>
-        <w:t>2. Исследование параметров schedule</w:t>
-      </w:r>
+        <w:t>Важно</w:t>
+      </w:r>
+      <w:proofErr w:type="gramStart"/>
+      <w:r>
+        <w:rPr>
+          <w:rFonts w:ascii="Times New Roman" w:eastAsia="Times New Roman" w:hAnsi="Times New Roman" w:cs="Times New Roman"/>
+          <w:i/>
+          <w:iCs/>
+          <w:color w:val="000000"/>
+          <w:sz w:val="27"/>
+          <w:szCs w:val="27"/>
+          <w:lang w:eastAsia="ru-RU"/>
+        </w:rPr>
+        <w:t>:</w:t>
+      </w:r>
+      <w:r>
+        <w:rPr>
+          <w:rFonts w:ascii="Times New Roman" w:eastAsia="Times New Roman" w:hAnsi="Times New Roman" w:cs="Times New Roman"/>
+          <w:color w:val="000000"/>
+          <w:sz w:val="27"/>
+          <w:szCs w:val="27"/>
+          <w:lang w:eastAsia="ru-RU"/>
+        </w:rPr>
+        <w:t xml:space="preserve"> Обеспечить</w:t>
+      </w:r>
+      <w:proofErr w:type="gramEnd"/>
+      <w:r>
+        <w:rPr>
+          <w:rFonts w:ascii="Times New Roman" w:eastAsia="Times New Roman" w:hAnsi="Times New Roman" w:cs="Times New Roman"/>
+          <w:color w:val="000000"/>
+          <w:sz w:val="27"/>
+          <w:szCs w:val="27"/>
+          <w:lang w:eastAsia="ru-RU"/>
+        </w:rPr>
+        <w:t xml:space="preserve"> детерминированный ввод: исходные данные (матрица A и вектор b) должны заполняться одинаково при любом количестве потоков.</w:t>
+      </w:r>
+    </w:p>
+    <w:p>
+      <w:pPr>
+        <w:rPr>
+          <w:rFonts w:ascii="Times New Roman" w:eastAsia="Times New Roman" w:hAnsi="Times New Roman" w:cs="Times New Roman"/>
+          <w:color w:val="000000"/>
+          <w:sz w:val="27"/>
+          <w:szCs w:val="27"/>
+          <w:lang w:eastAsia="ru-RU"/>
+        </w:rPr>
+      </w:pPr>
+      <w:r>
+        <w:rPr>
+          <w:rFonts w:ascii="Times New Roman" w:eastAsia="Times New Roman" w:hAnsi="Times New Roman" w:cs="Times New Roman"/>
+          <w:b/>
+          <w:bCs/>
+          <w:color w:val="000000"/>
+          <w:sz w:val="27"/>
+          <w:szCs w:val="27"/>
+          <w:lang w:eastAsia="ru-RU"/>
+        </w:rPr>
+        <w:t xml:space="preserve">2. Исследование параметров </w:t>
+      </w:r>
+      <w:proofErr w:type="spellStart"/>
+      <w:r>
+        <w:rPr>
+          <w:rFonts w:ascii="Times New Roman" w:eastAsia="Times New Roman" w:hAnsi="Times New Roman" w:cs="Times New Roman"/>
+          <w:b/>
+          <w:bCs/>
+          <w:color w:val="000000"/>
+          <w:sz w:val="27"/>
+          <w:szCs w:val="27"/>
+          <w:lang w:eastAsia="ru-RU"/>
+        </w:rPr>
+        <w:t>schedule</w:t>
+      </w:r>
+      <w:proofErr w:type="spellEnd"/>
       <w:r>
         <w:rPr>
           <w:rFonts w:ascii="Times New Roman" w:eastAsia="Times New Roman" w:hAnsi="Times New Roman" w:cs="Times New Roman"/>
@@ -557,7 +910,185 @@
           <w:lang w:eastAsia="ru-RU"/>
         </w:rPr>
         <w:br/>
-        <w:t>Зафиксировать размерность задачи (n) и количество потоков. Исследовать влияние различных параметров расписания schedule(static, chunk), schedule(dynamic, chunk) и schedule(guided) на время выполнения итерации алгоритма.</w:t>
+        <w:t xml:space="preserve">Зафиксировать размерность задачи (n) и количество потоков. Исследовать влияние различных параметров расписания </w:t>
+      </w:r>
+      <w:proofErr w:type="spellStart"/>
+      <w:proofErr w:type="gramStart"/>
+      <w:r>
+        <w:rPr>
+          <w:rFonts w:ascii="Times New Roman" w:eastAsia="Times New Roman" w:hAnsi="Times New Roman" w:cs="Times New Roman"/>
+          <w:color w:val="000000"/>
+          <w:sz w:val="27"/>
+          <w:szCs w:val="27"/>
+          <w:lang w:eastAsia="ru-RU"/>
+        </w:rPr>
+        <w:t>schedule</w:t>
+      </w:r>
+      <w:proofErr w:type="spellEnd"/>
+      <w:r>
+        <w:rPr>
+          <w:rFonts w:ascii="Times New Roman" w:eastAsia="Times New Roman" w:hAnsi="Times New Roman" w:cs="Times New Roman"/>
+          <w:color w:val="000000"/>
+          <w:sz w:val="27"/>
+          <w:szCs w:val="27"/>
+          <w:lang w:eastAsia="ru-RU"/>
+        </w:rPr>
+        <w:t>(</w:t>
+      </w:r>
+      <w:proofErr w:type="spellStart"/>
+      <w:proofErr w:type="gramEnd"/>
+      <w:r>
+        <w:rPr>
+          <w:rFonts w:ascii="Times New Roman" w:eastAsia="Times New Roman" w:hAnsi="Times New Roman" w:cs="Times New Roman"/>
+          <w:color w:val="000000"/>
+          <w:sz w:val="27"/>
+          <w:szCs w:val="27"/>
+          <w:lang w:eastAsia="ru-RU"/>
+        </w:rPr>
+        <w:t>static</w:t>
+      </w:r>
+      <w:proofErr w:type="spellEnd"/>
+      <w:r>
+        <w:rPr>
+          <w:rFonts w:ascii="Times New Roman" w:eastAsia="Times New Roman" w:hAnsi="Times New Roman" w:cs="Times New Roman"/>
+          <w:color w:val="000000"/>
+          <w:sz w:val="27"/>
+          <w:szCs w:val="27"/>
+          <w:lang w:eastAsia="ru-RU"/>
+        </w:rPr>
+        <w:t xml:space="preserve">, </w:t>
+      </w:r>
+      <w:proofErr w:type="spellStart"/>
+      <w:r>
+        <w:rPr>
+          <w:rFonts w:ascii="Times New Roman" w:eastAsia="Times New Roman" w:hAnsi="Times New Roman" w:cs="Times New Roman"/>
+          <w:color w:val="000000"/>
+          <w:sz w:val="27"/>
+          <w:szCs w:val="27"/>
+          <w:lang w:eastAsia="ru-RU"/>
+        </w:rPr>
+        <w:t>chunk</w:t>
+      </w:r>
+      <w:proofErr w:type="spellEnd"/>
+      <w:r>
+        <w:rPr>
+          <w:rFonts w:ascii="Times New Roman" w:eastAsia="Times New Roman" w:hAnsi="Times New Roman" w:cs="Times New Roman"/>
+          <w:color w:val="000000"/>
+          <w:sz w:val="27"/>
+          <w:szCs w:val="27"/>
+          <w:lang w:eastAsia="ru-RU"/>
+        </w:rPr>
+        <w:t xml:space="preserve">), </w:t>
+      </w:r>
+      <w:proofErr w:type="spellStart"/>
+      <w:r>
+        <w:rPr>
+          <w:rFonts w:ascii="Times New Roman" w:eastAsia="Times New Roman" w:hAnsi="Times New Roman" w:cs="Times New Roman"/>
+          <w:color w:val="000000"/>
+          <w:sz w:val="27"/>
+          <w:szCs w:val="27"/>
+          <w:lang w:eastAsia="ru-RU"/>
+        </w:rPr>
+        <w:t>schedule</w:t>
+      </w:r>
+      <w:proofErr w:type="spellEnd"/>
+      <w:r>
+        <w:rPr>
+          <w:rFonts w:ascii="Times New Roman" w:eastAsia="Times New Roman" w:hAnsi="Times New Roman" w:cs="Times New Roman"/>
+          <w:color w:val="000000"/>
+          <w:sz w:val="27"/>
+          <w:szCs w:val="27"/>
+          <w:lang w:eastAsia="ru-RU"/>
+        </w:rPr>
+        <w:t>(</w:t>
+      </w:r>
+      <w:proofErr w:type="spellStart"/>
+      <w:r>
+        <w:rPr>
+          <w:rFonts w:ascii="Times New Roman" w:eastAsia="Times New Roman" w:hAnsi="Times New Roman" w:cs="Times New Roman"/>
+          <w:color w:val="000000"/>
+          <w:sz w:val="27"/>
+          <w:szCs w:val="27"/>
+          <w:lang w:eastAsia="ru-RU"/>
+        </w:rPr>
+        <w:t>dynamic</w:t>
+      </w:r>
+      <w:proofErr w:type="spellEnd"/>
+      <w:r>
+        <w:rPr>
+          <w:rFonts w:ascii="Times New Roman" w:eastAsia="Times New Roman" w:hAnsi="Times New Roman" w:cs="Times New Roman"/>
+          <w:color w:val="000000"/>
+          <w:sz w:val="27"/>
+          <w:szCs w:val="27"/>
+          <w:lang w:eastAsia="ru-RU"/>
+        </w:rPr>
+        <w:t xml:space="preserve">, </w:t>
+      </w:r>
+      <w:proofErr w:type="spellStart"/>
+      <w:r>
+        <w:rPr>
+          <w:rFonts w:ascii="Times New Roman" w:eastAsia="Times New Roman" w:hAnsi="Times New Roman" w:cs="Times New Roman"/>
+          <w:color w:val="000000"/>
+          <w:sz w:val="27"/>
+          <w:szCs w:val="27"/>
+          <w:lang w:eastAsia="ru-RU"/>
+        </w:rPr>
+        <w:t>chunk</w:t>
+      </w:r>
+      <w:proofErr w:type="spellEnd"/>
+      <w:r>
+        <w:rPr>
+          <w:rFonts w:ascii="Times New Roman" w:eastAsia="Times New Roman" w:hAnsi="Times New Roman" w:cs="Times New Roman"/>
+          <w:color w:val="000000"/>
+          <w:sz w:val="27"/>
+          <w:szCs w:val="27"/>
+          <w:lang w:eastAsia="ru-RU"/>
+        </w:rPr>
+        <w:t xml:space="preserve">) и </w:t>
+      </w:r>
+      <w:proofErr w:type="spellStart"/>
+      <w:r>
+        <w:rPr>
+          <w:rFonts w:ascii="Times New Roman" w:eastAsia="Times New Roman" w:hAnsi="Times New Roman" w:cs="Times New Roman"/>
+          <w:color w:val="000000"/>
+          <w:sz w:val="27"/>
+          <w:szCs w:val="27"/>
+          <w:lang w:eastAsia="ru-RU"/>
+        </w:rPr>
+        <w:t>schedule</w:t>
+      </w:r>
+      <w:proofErr w:type="spellEnd"/>
+      <w:r>
+        <w:rPr>
+          <w:rFonts w:ascii="Times New Roman" w:eastAsia="Times New Roman" w:hAnsi="Times New Roman" w:cs="Times New Roman"/>
+          <w:color w:val="000000"/>
+          <w:sz w:val="27"/>
+          <w:szCs w:val="27"/>
+          <w:lang w:eastAsia="ru-RU"/>
+        </w:rPr>
+        <w:t>(</w:t>
+      </w:r>
+      <w:proofErr w:type="spellStart"/>
+      <w:r>
+        <w:rPr>
+          <w:rFonts w:ascii="Times New Roman" w:eastAsia="Times New Roman" w:hAnsi="Times New Roman" w:cs="Times New Roman"/>
+          <w:color w:val="000000"/>
+          <w:sz w:val="27"/>
+          <w:szCs w:val="27"/>
+          <w:lang w:eastAsia="ru-RU"/>
+        </w:rPr>
+        <w:t>guided</w:t>
+      </w:r>
+      <w:proofErr w:type="spellEnd"/>
+      <w:r>
+        <w:rPr>
+          <w:rFonts w:ascii="Times New Roman" w:eastAsia="Times New Roman" w:hAnsi="Times New Roman" w:cs="Times New Roman"/>
+          <w:color w:val="000000"/>
+          <w:sz w:val="27"/>
+          <w:szCs w:val="27"/>
+          <w:lang w:eastAsia="ru-RU"/>
+        </w:rPr>
+        <w:t>) на время выполнения итерации алгоритма.</w:t>
       </w:r>
     </w:p>
     <w:p>
@@ -762,6 +1293,8 @@
           <w:szCs w:val="36"/>
         </w:rPr>
       </w:pPr>
+      <w:bookmarkStart w:id="0" w:name="_GoBack"/>
+      <w:bookmarkEnd w:id="0"/>
     </w:p>
     <w:p>
       <w:pPr>
@@ -780,15 +1313,14 @@
       </w:pPr>
       <w:r>
         <w:rPr>
-          <w:noProof/>
           <w:sz w:val="36"/>
           <w:szCs w:val="36"/>
         </w:rPr>
         <w:drawing>
-          <wp:inline distT="0" distB="0" distL="0" distR="0" wp14:anchorId="5F52EDE2" wp14:editId="3971450C">
-            <wp:extent cx="6278880" cy="3302201"/>
-            <wp:effectExtent l="0" t="0" r="7620" b="0"/>
-            <wp:docPr id="5" name="Рисунок 5"/>
+          <wp:inline distT="0" distB="0" distL="0" distR="0" wp14:anchorId="5A70D323" wp14:editId="6140D89B">
+            <wp:extent cx="6272179" cy="2941320"/>
+            <wp:effectExtent l="0" t="0" r="0" b="0"/>
+            <wp:docPr id="4" name="Рисунок 4"/>
             <wp:cNvGraphicFramePr>
               <a:graphicFrameLocks xmlns:a="http://schemas.openxmlformats.org/drawingml/2006/main" noChangeAspect="1"/>
             </wp:cNvGraphicFramePr>
@@ -808,7 +1340,7 @@
                   <pic:spPr>
                     <a:xfrm>
                       <a:off x="0" y="0"/>
-                      <a:ext cx="6295477" cy="3310930"/>
+                      <a:ext cx="6288588" cy="2949015"/>
                     </a:xfrm>
                     <a:prstGeom prst="rect">
                       <a:avLst/>
@@ -840,42 +1372,64 @@
           <w:szCs w:val="32"/>
         </w:rPr>
       </w:pPr>
-    </w:p>
-    <w:p>
-      <w:pPr>
-        <w:rPr>
-          <w:b/>
-          <w:bCs/>
-          <w:sz w:val="32"/>
-          <w:szCs w:val="32"/>
-        </w:rPr>
-      </w:pPr>
-    </w:p>
-    <w:p>
-      <w:pPr>
-        <w:rPr>
-          <w:b/>
-          <w:bCs/>
-          <w:sz w:val="32"/>
-          <w:szCs w:val="32"/>
-        </w:rPr>
-      </w:pPr>
-    </w:p>
-    <w:p>
-      <w:pPr>
-        <w:rPr>
-          <w:sz w:val="32"/>
-          <w:szCs w:val="32"/>
-        </w:rPr>
-      </w:pPr>
-      <w:r>
-        <w:rPr>
-          <w:b/>
-          <w:bCs/>
+      <w:r>
+        <w:rPr>
+          <w:b/>
+          <w:bCs/>
+          <w:noProof/>
           <w:sz w:val="32"/>
           <w:szCs w:val="32"/>
         </w:rPr>
         <w:lastRenderedPageBreak/>
+        <w:drawing>
+          <wp:inline distT="0" distB="0" distL="0" distR="0" wp14:anchorId="273A22EB" wp14:editId="03F2DE1A">
+            <wp:extent cx="6187440" cy="4015740"/>
+            <wp:effectExtent l="0" t="0" r="3810" b="3810"/>
+            <wp:docPr id="8" name="Диаграмма 8"/>
+            <wp:cNvGraphicFramePr/>
+            <a:graphic xmlns:a="http://schemas.openxmlformats.org/drawingml/2006/main">
+              <a:graphicData uri="http://schemas.openxmlformats.org/drawingml/2006/chart">
+                <c:chart xmlns:c="http://schemas.openxmlformats.org/drawingml/2006/chart" xmlns:r="http://schemas.openxmlformats.org/officeDocument/2006/relationships" r:id="rId9"/>
+              </a:graphicData>
+            </a:graphic>
+          </wp:inline>
+        </w:drawing>
+      </w:r>
+    </w:p>
+    <w:p>
+      <w:pPr>
+        <w:rPr>
+          <w:b/>
+          <w:bCs/>
+          <w:sz w:val="32"/>
+          <w:szCs w:val="32"/>
+        </w:rPr>
+      </w:pPr>
+    </w:p>
+    <w:p>
+      <w:pPr>
+        <w:rPr>
+          <w:b/>
+          <w:bCs/>
+          <w:sz w:val="32"/>
+          <w:szCs w:val="32"/>
+        </w:rPr>
+      </w:pPr>
+    </w:p>
+    <w:p>
+      <w:pPr>
+        <w:rPr>
+          <w:sz w:val="32"/>
+          <w:szCs w:val="32"/>
+        </w:rPr>
+      </w:pPr>
+      <w:r>
+        <w:rPr>
+          <w:b/>
+          <w:bCs/>
+          <w:sz w:val="32"/>
+          <w:szCs w:val="32"/>
+        </w:rPr>
         <w:t>Зависимость</w:t>
       </w:r>
       <w:r>
@@ -978,23 +1532,44 @@
           <w:sz w:val="32"/>
           <w:szCs w:val="32"/>
         </w:rPr>
-        <w:t>Эффективност</w:t>
-      </w:r>
-      <w:r>
-        <w:rPr>
-          <w:b/>
-          <w:bCs/>
-          <w:sz w:val="32"/>
-          <w:szCs w:val="32"/>
-        </w:rPr>
-        <w:t>ь</w:t>
-      </w:r>
-      <w:r>
-        <w:rPr>
-          <w:sz w:val="32"/>
-          <w:szCs w:val="32"/>
-        </w:rPr>
-        <w:t>: Guided показал себя наиболее стабильным и эффективным на малых размерах блоков, так как он динамически адаптирует размер куска работы.</w:t>
+        <w:t>Эффективность</w:t>
+      </w:r>
+      <w:r>
+        <w:rPr>
+          <w:sz w:val="32"/>
+          <w:szCs w:val="32"/>
+        </w:rPr>
+        <w:t xml:space="preserve">: </w:t>
+      </w:r>
+      <w:proofErr w:type="spellStart"/>
+      <w:r>
+        <w:rPr>
+          <w:sz w:val="32"/>
+          <w:szCs w:val="32"/>
+        </w:rPr>
+        <w:t>Guided</w:t>
+      </w:r>
+      <w:proofErr w:type="spellEnd"/>
+      <w:r>
+        <w:rPr>
+          <w:sz w:val="32"/>
+          <w:szCs w:val="32"/>
+        </w:rPr>
+        <w:t xml:space="preserve"> показал себя наиболее стабильным и эффективным на малых размерах блоков</w:t>
+      </w:r>
+      <w:r>
+        <w:rPr>
+          <w:sz w:val="32"/>
+          <w:szCs w:val="32"/>
+        </w:rPr>
+        <w:t xml:space="preserve"> (до 64)</w:t>
+      </w:r>
+      <w:r>
+        <w:rPr>
+          <w:sz w:val="32"/>
+          <w:szCs w:val="32"/>
+        </w:rPr>
+        <w:t>, так как он динамически адаптирует размер куска работы.</w:t>
       </w:r>
     </w:p>
     <w:p>
@@ -1033,24 +1608,8 @@
           <w:sz w:val="32"/>
           <w:szCs w:val="32"/>
         </w:rPr>
-        <w:t>у</w:t>
-      </w:r>
-      <w:r>
-        <w:rPr>
-          <w:sz w:val="32"/>
-          <w:szCs w:val="32"/>
-        </w:rPr>
-        <w:t xml:space="preserve">т </w:t>
-      </w:r>
-      <w:r>
-        <w:rPr>
-          <w:sz w:val="32"/>
-          <w:szCs w:val="32"/>
-        </w:rPr>
-        <w:t xml:space="preserve">значения близкие к </w:t>
-      </w:r>
-      <w:bookmarkStart w:id="0" w:name="_GoBack"/>
-      <w:bookmarkEnd w:id="0"/>
+        <w:t xml:space="preserve">ет </w:t>
+      </w:r>
       <w:r>
         <w:rPr>
           <w:sz w:val="32"/>
@@ -1286,30 +1845,14 @@
         </w:rPr>
         <w:t xml:space="preserve"> </w:t>
       </w:r>
-      <w:hyperlink r:id="rId9" w:history="1">
+      <w:hyperlink r:id="rId10" w:history="1">
         <w:r>
           <w:rPr>
             <w:rStyle w:val="a3"/>
             <w:sz w:val="28"/>
             <w:szCs w:val="28"/>
           </w:rPr>
-          <w:t>https://github.com/DrySparrow/24205-obmetko-opp-cpp/</w:t>
-        </w:r>
-        <w:r>
-          <w:rPr>
-            <w:rStyle w:val="a3"/>
-            <w:sz w:val="28"/>
-            <w:szCs w:val="28"/>
-          </w:rPr>
-          <w:t>t</w:t>
-        </w:r>
-        <w:r>
-          <w:rPr>
-            <w:rStyle w:val="a3"/>
-            <w:sz w:val="28"/>
-            <w:szCs w:val="28"/>
-          </w:rPr>
-          <w:t>ree/lab-2/lab-2</w:t>
+          <w:t>https://github.com/DrySparrow/24205-obmetko-opp-cpp/tree/lab-2/lab-2</w:t>
         </w:r>
       </w:hyperlink>
     </w:p>
@@ -2020,6 +2563,1130 @@
 </w:styles>
 </file>
 
+<file path=word/charts/chart1.xml><?xml version="1.0" encoding="utf-8"?>
+<c:chartSpace xmlns:c="http://schemas.openxmlformats.org/drawingml/2006/chart" xmlns:a="http://schemas.openxmlformats.org/drawingml/2006/main" xmlns:r="http://schemas.openxmlformats.org/officeDocument/2006/relationships" xmlns:c16r2="http://schemas.microsoft.com/office/drawing/2015/06/chart">
+  <c:date1904 val="0"/>
+  <c:lang val="ru-RU"/>
+  <c:roundedCorners val="0"/>
+  <mc:AlternateContent xmlns:mc="http://schemas.openxmlformats.org/markup-compatibility/2006">
+    <mc:Choice xmlns:c14="http://schemas.microsoft.com/office/drawing/2007/8/2/chart" Requires="c14">
+      <c14:style val="102"/>
+    </mc:Choice>
+    <mc:Fallback>
+      <c:style val="2"/>
+    </mc:Fallback>
+  </mc:AlternateContent>
+  <c:chart>
+    <c:title>
+      <c:tx>
+        <c:rich>
+          <a:bodyPr rot="0" spcFirstLastPara="1" vertOverflow="ellipsis" vert="horz" wrap="square" anchor="ctr" anchorCtr="1"/>
+          <a:lstStyle/>
+          <a:p>
+            <a:pPr>
+              <a:defRPr sz="1400" b="0" i="0" u="none" strike="noStrike" kern="1200" spc="0" baseline="0">
+                <a:solidFill>
+                  <a:schemeClr val="tx1">
+                    <a:lumMod val="65000"/>
+                    <a:lumOff val="35000"/>
+                  </a:schemeClr>
+                </a:solidFill>
+                <a:latin typeface="+mn-lt"/>
+                <a:ea typeface="+mn-ea"/>
+                <a:cs typeface="+mn-cs"/>
+              </a:defRPr>
+            </a:pPr>
+            <a:r>
+              <a:rPr lang="ru-RU"/>
+              <a:t>график</a:t>
+            </a:r>
+            <a:r>
+              <a:rPr lang="ru-RU" baseline="0"/>
+              <a:t> времени</a:t>
+            </a:r>
+          </a:p>
+        </c:rich>
+      </c:tx>
+      <c:overlay val="0"/>
+      <c:spPr>
+        <a:noFill/>
+        <a:ln>
+          <a:noFill/>
+        </a:ln>
+        <a:effectLst/>
+      </c:spPr>
+      <c:txPr>
+        <a:bodyPr rot="0" spcFirstLastPara="1" vertOverflow="ellipsis" vert="horz" wrap="square" anchor="ctr" anchorCtr="1"/>
+        <a:lstStyle/>
+        <a:p>
+          <a:pPr>
+            <a:defRPr sz="1400" b="0" i="0" u="none" strike="noStrike" kern="1200" spc="0" baseline="0">
+              <a:solidFill>
+                <a:schemeClr val="tx1">
+                  <a:lumMod val="65000"/>
+                  <a:lumOff val="35000"/>
+                </a:schemeClr>
+              </a:solidFill>
+              <a:latin typeface="+mn-lt"/>
+              <a:ea typeface="+mn-ea"/>
+              <a:cs typeface="+mn-cs"/>
+            </a:defRPr>
+          </a:pPr>
+          <a:endParaRPr lang="ru-RU"/>
+        </a:p>
+      </c:txPr>
+    </c:title>
+    <c:autoTitleDeleted val="0"/>
+    <c:plotArea>
+      <c:layout>
+        <c:manualLayout>
+          <c:layoutTarget val="inner"/>
+          <c:xMode val="edge"/>
+          <c:yMode val="edge"/>
+          <c:x val="4.9197729594145562E-2"/>
+          <c:y val="0.12641445126107703"/>
+          <c:w val="0.92822427368992666"/>
+          <c:h val="0.73700277495987832"/>
+        </c:manualLayout>
+      </c:layout>
+      <c:lineChart>
+        <c:grouping val="standard"/>
+        <c:varyColors val="0"/>
+        <c:ser>
+          <c:idx val="0"/>
+          <c:order val="0"/>
+          <c:tx>
+            <c:strRef>
+              <c:f>Лист1!$B$1</c:f>
+              <c:strCache>
+                <c:ptCount val="1"/>
+                <c:pt idx="0">
+                  <c:v>Static</c:v>
+                </c:pt>
+              </c:strCache>
+            </c:strRef>
+          </c:tx>
+          <c:spPr>
+            <a:ln w="28575" cap="rnd">
+              <a:solidFill>
+                <a:schemeClr val="accent1"/>
+              </a:solidFill>
+              <a:round/>
+            </a:ln>
+            <a:effectLst/>
+          </c:spPr>
+          <c:marker>
+            <c:symbol val="circle"/>
+            <c:size val="5"/>
+            <c:spPr>
+              <a:solidFill>
+                <a:schemeClr val="accent1"/>
+              </a:solidFill>
+              <a:ln w="9525">
+                <a:solidFill>
+                  <a:schemeClr val="accent1"/>
+                </a:solidFill>
+              </a:ln>
+              <a:effectLst/>
+            </c:spPr>
+          </c:marker>
+          <c:cat>
+            <c:numRef>
+              <c:f>Лист1!$A$2:$A$6</c:f>
+              <c:numCache>
+                <c:formatCode>General</c:formatCode>
+                <c:ptCount val="5"/>
+                <c:pt idx="0">
+                  <c:v>4</c:v>
+                </c:pt>
+                <c:pt idx="1">
+                  <c:v>16</c:v>
+                </c:pt>
+                <c:pt idx="2">
+                  <c:v>64</c:v>
+                </c:pt>
+                <c:pt idx="3">
+                  <c:v>256</c:v>
+                </c:pt>
+                <c:pt idx="4">
+                  <c:v>1024</c:v>
+                </c:pt>
+              </c:numCache>
+            </c:numRef>
+          </c:cat>
+          <c:val>
+            <c:numRef>
+              <c:f>Лист1!$B$2:$B$6</c:f>
+              <c:numCache>
+                <c:formatCode>General</c:formatCode>
+                <c:ptCount val="5"/>
+                <c:pt idx="0">
+                  <c:v>32.118099999999998</c:v>
+                </c:pt>
+                <c:pt idx="1">
+                  <c:v>28.208600000000001</c:v>
+                </c:pt>
+                <c:pt idx="2">
+                  <c:v>24.3536</c:v>
+                </c:pt>
+                <c:pt idx="3">
+                  <c:v>27.7437</c:v>
+                </c:pt>
+                <c:pt idx="4">
+                  <c:v>41.152099999999997</c:v>
+                </c:pt>
+              </c:numCache>
+            </c:numRef>
+          </c:val>
+          <c:smooth val="0"/>
+          <c:extLst>
+            <c:ext xmlns:c16="http://schemas.microsoft.com/office/drawing/2014/chart" uri="{C3380CC4-5D6E-409C-BE32-E72D297353CC}">
+              <c16:uniqueId val="{00000000-4195-417C-BCFF-BF8C4A231311}"/>
+            </c:ext>
+          </c:extLst>
+        </c:ser>
+        <c:ser>
+          <c:idx val="1"/>
+          <c:order val="1"/>
+          <c:tx>
+            <c:strRef>
+              <c:f>Лист1!$C$1</c:f>
+              <c:strCache>
+                <c:ptCount val="1"/>
+                <c:pt idx="0">
+                  <c:v>Dynamic</c:v>
+                </c:pt>
+              </c:strCache>
+            </c:strRef>
+          </c:tx>
+          <c:spPr>
+            <a:ln w="28575" cap="rnd">
+              <a:solidFill>
+                <a:schemeClr val="accent2"/>
+              </a:solidFill>
+              <a:round/>
+            </a:ln>
+            <a:effectLst/>
+          </c:spPr>
+          <c:marker>
+            <c:symbol val="circle"/>
+            <c:size val="5"/>
+            <c:spPr>
+              <a:solidFill>
+                <a:schemeClr val="accent2"/>
+              </a:solidFill>
+              <a:ln w="9525">
+                <a:solidFill>
+                  <a:schemeClr val="accent2"/>
+                </a:solidFill>
+              </a:ln>
+              <a:effectLst/>
+            </c:spPr>
+          </c:marker>
+          <c:cat>
+            <c:numRef>
+              <c:f>Лист1!$A$2:$A$6</c:f>
+              <c:numCache>
+                <c:formatCode>General</c:formatCode>
+                <c:ptCount val="5"/>
+                <c:pt idx="0">
+                  <c:v>4</c:v>
+                </c:pt>
+                <c:pt idx="1">
+                  <c:v>16</c:v>
+                </c:pt>
+                <c:pt idx="2">
+                  <c:v>64</c:v>
+                </c:pt>
+                <c:pt idx="3">
+                  <c:v>256</c:v>
+                </c:pt>
+                <c:pt idx="4">
+                  <c:v>1024</c:v>
+                </c:pt>
+              </c:numCache>
+            </c:numRef>
+          </c:cat>
+          <c:val>
+            <c:numRef>
+              <c:f>Лист1!$C$2:$C$6</c:f>
+              <c:numCache>
+                <c:formatCode>General</c:formatCode>
+                <c:ptCount val="5"/>
+                <c:pt idx="0">
+                  <c:v>36.439</c:v>
+                </c:pt>
+                <c:pt idx="1">
+                  <c:v>27.9556</c:v>
+                </c:pt>
+                <c:pt idx="2">
+                  <c:v>26.396100000000001</c:v>
+                </c:pt>
+                <c:pt idx="3">
+                  <c:v>30.063400000000001</c:v>
+                </c:pt>
+                <c:pt idx="4">
+                  <c:v>54.106699999999996</c:v>
+                </c:pt>
+              </c:numCache>
+            </c:numRef>
+          </c:val>
+          <c:smooth val="0"/>
+          <c:extLst>
+            <c:ext xmlns:c16="http://schemas.microsoft.com/office/drawing/2014/chart" uri="{C3380CC4-5D6E-409C-BE32-E72D297353CC}">
+              <c16:uniqueId val="{00000001-4195-417C-BCFF-BF8C4A231311}"/>
+            </c:ext>
+          </c:extLst>
+        </c:ser>
+        <c:ser>
+          <c:idx val="2"/>
+          <c:order val="2"/>
+          <c:tx>
+            <c:strRef>
+              <c:f>Лист1!$D$1</c:f>
+              <c:strCache>
+                <c:ptCount val="1"/>
+                <c:pt idx="0">
+                  <c:v>Guided</c:v>
+                </c:pt>
+              </c:strCache>
+            </c:strRef>
+          </c:tx>
+          <c:spPr>
+            <a:ln w="28575" cap="rnd">
+              <a:solidFill>
+                <a:schemeClr val="accent3"/>
+              </a:solidFill>
+              <a:round/>
+            </a:ln>
+            <a:effectLst/>
+          </c:spPr>
+          <c:marker>
+            <c:symbol val="circle"/>
+            <c:size val="5"/>
+            <c:spPr>
+              <a:solidFill>
+                <a:schemeClr val="accent3"/>
+              </a:solidFill>
+              <a:ln w="9525">
+                <a:solidFill>
+                  <a:schemeClr val="accent3"/>
+                </a:solidFill>
+              </a:ln>
+              <a:effectLst/>
+            </c:spPr>
+          </c:marker>
+          <c:cat>
+            <c:numRef>
+              <c:f>Лист1!$A$2:$A$6</c:f>
+              <c:numCache>
+                <c:formatCode>General</c:formatCode>
+                <c:ptCount val="5"/>
+                <c:pt idx="0">
+                  <c:v>4</c:v>
+                </c:pt>
+                <c:pt idx="1">
+                  <c:v>16</c:v>
+                </c:pt>
+                <c:pt idx="2">
+                  <c:v>64</c:v>
+                </c:pt>
+                <c:pt idx="3">
+                  <c:v>256</c:v>
+                </c:pt>
+                <c:pt idx="4">
+                  <c:v>1024</c:v>
+                </c:pt>
+              </c:numCache>
+            </c:numRef>
+          </c:cat>
+          <c:val>
+            <c:numRef>
+              <c:f>Лист1!$D$2:$D$6</c:f>
+              <c:numCache>
+                <c:formatCode>General</c:formatCode>
+                <c:ptCount val="5"/>
+                <c:pt idx="0">
+                  <c:v>25.358699999999999</c:v>
+                </c:pt>
+                <c:pt idx="1">
+                  <c:v>25.303599999999999</c:v>
+                </c:pt>
+                <c:pt idx="2">
+                  <c:v>25.719899999999999</c:v>
+                </c:pt>
+                <c:pt idx="3">
+                  <c:v>29.843</c:v>
+                </c:pt>
+                <c:pt idx="4">
+                  <c:v>53.631300000000003</c:v>
+                </c:pt>
+              </c:numCache>
+            </c:numRef>
+          </c:val>
+          <c:smooth val="0"/>
+          <c:extLst>
+            <c:ext xmlns:c16="http://schemas.microsoft.com/office/drawing/2014/chart" uri="{C3380CC4-5D6E-409C-BE32-E72D297353CC}">
+              <c16:uniqueId val="{00000002-4195-417C-BCFF-BF8C4A231311}"/>
+            </c:ext>
+          </c:extLst>
+        </c:ser>
+        <c:dLbls>
+          <c:showLegendKey val="0"/>
+          <c:showVal val="0"/>
+          <c:showCatName val="0"/>
+          <c:showSerName val="0"/>
+          <c:showPercent val="0"/>
+          <c:showBubbleSize val="0"/>
+        </c:dLbls>
+        <c:marker val="1"/>
+        <c:smooth val="0"/>
+        <c:axId val="1170592703"/>
+        <c:axId val="1223811231"/>
+      </c:lineChart>
+      <c:catAx>
+        <c:axId val="1170592703"/>
+        <c:scaling>
+          <c:orientation val="minMax"/>
+        </c:scaling>
+        <c:delete val="0"/>
+        <c:axPos val="b"/>
+        <c:numFmt formatCode="General" sourceLinked="1"/>
+        <c:majorTickMark val="none"/>
+        <c:minorTickMark val="none"/>
+        <c:tickLblPos val="nextTo"/>
+        <c:spPr>
+          <a:noFill/>
+          <a:ln w="9525" cap="flat" cmpd="sng" algn="ctr">
+            <a:solidFill>
+              <a:schemeClr val="tx1">
+                <a:lumMod val="15000"/>
+                <a:lumOff val="85000"/>
+              </a:schemeClr>
+            </a:solidFill>
+            <a:round/>
+          </a:ln>
+          <a:effectLst/>
+        </c:spPr>
+        <c:txPr>
+          <a:bodyPr rot="-60000000" spcFirstLastPara="1" vertOverflow="ellipsis" vert="horz" wrap="square" anchor="ctr" anchorCtr="1"/>
+          <a:lstStyle/>
+          <a:p>
+            <a:pPr>
+              <a:defRPr sz="900" b="0" i="0" u="none" strike="noStrike" kern="1200" baseline="0">
+                <a:solidFill>
+                  <a:schemeClr val="tx1">
+                    <a:lumMod val="65000"/>
+                    <a:lumOff val="35000"/>
+                  </a:schemeClr>
+                </a:solidFill>
+                <a:latin typeface="+mn-lt"/>
+                <a:ea typeface="+mn-ea"/>
+                <a:cs typeface="+mn-cs"/>
+              </a:defRPr>
+            </a:pPr>
+            <a:endParaRPr lang="ru-RU"/>
+          </a:p>
+        </c:txPr>
+        <c:crossAx val="1223811231"/>
+        <c:crosses val="autoZero"/>
+        <c:auto val="1"/>
+        <c:lblAlgn val="ctr"/>
+        <c:lblOffset val="100"/>
+        <c:noMultiLvlLbl val="0"/>
+      </c:catAx>
+      <c:valAx>
+        <c:axId val="1223811231"/>
+        <c:scaling>
+          <c:orientation val="minMax"/>
+          <c:max val="55"/>
+          <c:min val="20"/>
+        </c:scaling>
+        <c:delete val="0"/>
+        <c:axPos val="l"/>
+        <c:majorGridlines>
+          <c:spPr>
+            <a:ln w="9525" cap="flat" cmpd="sng" algn="ctr">
+              <a:solidFill>
+                <a:schemeClr val="tx1">
+                  <a:lumMod val="15000"/>
+                  <a:lumOff val="85000"/>
+                </a:schemeClr>
+              </a:solidFill>
+              <a:round/>
+            </a:ln>
+            <a:effectLst/>
+          </c:spPr>
+        </c:majorGridlines>
+        <c:numFmt formatCode="General" sourceLinked="1"/>
+        <c:majorTickMark val="none"/>
+        <c:minorTickMark val="none"/>
+        <c:tickLblPos val="nextTo"/>
+        <c:spPr>
+          <a:noFill/>
+          <a:ln>
+            <a:noFill/>
+          </a:ln>
+          <a:effectLst/>
+        </c:spPr>
+        <c:txPr>
+          <a:bodyPr rot="-60000000" spcFirstLastPara="1" vertOverflow="ellipsis" vert="horz" wrap="square" anchor="ctr" anchorCtr="1"/>
+          <a:lstStyle/>
+          <a:p>
+            <a:pPr>
+              <a:defRPr sz="900" b="0" i="0" u="none" strike="noStrike" kern="1200" baseline="0">
+                <a:solidFill>
+                  <a:schemeClr val="tx1">
+                    <a:lumMod val="65000"/>
+                    <a:lumOff val="35000"/>
+                  </a:schemeClr>
+                </a:solidFill>
+                <a:latin typeface="+mn-lt"/>
+                <a:ea typeface="+mn-ea"/>
+                <a:cs typeface="+mn-cs"/>
+              </a:defRPr>
+            </a:pPr>
+            <a:endParaRPr lang="ru-RU"/>
+          </a:p>
+        </c:txPr>
+        <c:crossAx val="1170592703"/>
+        <c:crosses val="autoZero"/>
+        <c:crossBetween val="between"/>
+      </c:valAx>
+      <c:spPr>
+        <a:noFill/>
+        <a:ln>
+          <a:noFill/>
+        </a:ln>
+        <a:effectLst/>
+      </c:spPr>
+    </c:plotArea>
+    <c:legend>
+      <c:legendPos val="b"/>
+      <c:layout>
+        <c:manualLayout>
+          <c:xMode val="edge"/>
+          <c:yMode val="edge"/>
+          <c:x val="0.28185097552461114"/>
+          <c:y val="0.91184339623581212"/>
+          <c:w val="0.4034573264548828"/>
+          <c:h val="6.9181271695876706E-2"/>
+        </c:manualLayout>
+      </c:layout>
+      <c:overlay val="0"/>
+      <c:spPr>
+        <a:noFill/>
+        <a:ln>
+          <a:noFill/>
+        </a:ln>
+        <a:effectLst/>
+      </c:spPr>
+      <c:txPr>
+        <a:bodyPr rot="0" spcFirstLastPara="1" vertOverflow="ellipsis" vert="horz" wrap="square" anchor="ctr" anchorCtr="1"/>
+        <a:lstStyle/>
+        <a:p>
+          <a:pPr>
+            <a:defRPr sz="1200" b="0" i="0" u="none" strike="noStrike" kern="1200" baseline="0">
+              <a:solidFill>
+                <a:schemeClr val="tx1">
+                  <a:lumMod val="65000"/>
+                  <a:lumOff val="35000"/>
+                </a:schemeClr>
+              </a:solidFill>
+              <a:latin typeface="+mn-lt"/>
+              <a:ea typeface="+mn-ea"/>
+              <a:cs typeface="+mn-cs"/>
+            </a:defRPr>
+          </a:pPr>
+          <a:endParaRPr lang="ru-RU"/>
+        </a:p>
+      </c:txPr>
+    </c:legend>
+    <c:plotVisOnly val="1"/>
+    <c:dispBlanksAs val="zero"/>
+    <c:extLst>
+      <c:ext xmlns:c16r3="http://schemas.microsoft.com/office/drawing/2017/03/chart" uri="{56B9EC1D-385E-4148-901F-78D8002777C0}">
+        <c16r3:dataDisplayOptions16>
+          <c16r3:dispNaAsBlank val="1"/>
+        </c16r3:dataDisplayOptions16>
+      </c:ext>
+    </c:extLst>
+    <c:showDLblsOverMax val="0"/>
+  </c:chart>
+  <c:spPr>
+    <a:solidFill>
+      <a:schemeClr val="bg1"/>
+    </a:solidFill>
+    <a:ln w="9525" cap="flat" cmpd="sng" algn="ctr">
+      <a:solidFill>
+        <a:schemeClr val="tx1">
+          <a:lumMod val="15000"/>
+          <a:lumOff val="85000"/>
+        </a:schemeClr>
+      </a:solidFill>
+      <a:round/>
+    </a:ln>
+    <a:effectLst/>
+  </c:spPr>
+  <c:txPr>
+    <a:bodyPr/>
+    <a:lstStyle/>
+    <a:p>
+      <a:pPr>
+        <a:defRPr/>
+      </a:pPr>
+      <a:endParaRPr lang="ru-RU"/>
+    </a:p>
+  </c:txPr>
+  <c:externalData r:id="rId3">
+    <c:autoUpdate val="0"/>
+  </c:externalData>
+</c:chartSpace>
+</file>
+
+<file path=word/charts/colors1.xml><?xml version="1.0" encoding="utf-8"?>
+<cs:colorStyle xmlns:cs="http://schemas.microsoft.com/office/drawing/2012/chartStyle" xmlns:a="http://schemas.openxmlformats.org/drawingml/2006/main" meth="cycle" id="10">
+  <a:schemeClr val="accent1"/>
+  <a:schemeClr val="accent2"/>
+  <a:schemeClr val="accent3"/>
+  <a:schemeClr val="accent4"/>
+  <a:schemeClr val="accent5"/>
+  <a:schemeClr val="accent6"/>
+  <cs:variation/>
+  <cs:variation>
+    <a:lumMod val="60000"/>
+  </cs:variation>
+  <cs:variation>
+    <a:lumMod val="80000"/>
+    <a:lumOff val="20000"/>
+  </cs:variation>
+  <cs:variation>
+    <a:lumMod val="80000"/>
+  </cs:variation>
+  <cs:variation>
+    <a:lumMod val="60000"/>
+    <a:lumOff val="40000"/>
+  </cs:variation>
+  <cs:variation>
+    <a:lumMod val="50000"/>
+  </cs:variation>
+  <cs:variation>
+    <a:lumMod val="70000"/>
+    <a:lumOff val="30000"/>
+  </cs:variation>
+  <cs:variation>
+    <a:lumMod val="70000"/>
+  </cs:variation>
+  <cs:variation>
+    <a:lumMod val="50000"/>
+    <a:lumOff val="50000"/>
+  </cs:variation>
+</cs:colorStyle>
+</file>
+
+<file path=word/charts/style1.xml><?xml version="1.0" encoding="utf-8"?>
+<cs:chartStyle xmlns:cs="http://schemas.microsoft.com/office/drawing/2012/chartStyle" xmlns:a="http://schemas.openxmlformats.org/drawingml/2006/main" id="332">
+  <cs:axisTitle>
+    <cs:lnRef idx="0"/>
+    <cs:fillRef idx="0"/>
+    <cs:effectRef idx="0"/>
+    <cs:fontRef idx="minor">
+      <a:schemeClr val="tx1">
+        <a:lumMod val="65000"/>
+        <a:lumOff val="35000"/>
+      </a:schemeClr>
+    </cs:fontRef>
+    <cs:defRPr sz="1000" kern="1200"/>
+  </cs:axisTitle>
+  <cs:categoryAxis>
+    <cs:lnRef idx="0"/>
+    <cs:fillRef idx="0"/>
+    <cs:effectRef idx="0"/>
+    <cs:fontRef idx="minor">
+      <a:schemeClr val="tx1">
+        <a:lumMod val="65000"/>
+        <a:lumOff val="35000"/>
+      </a:schemeClr>
+    </cs:fontRef>
+    <cs:spPr>
+      <a:ln w="9525" cap="flat" cmpd="sng" algn="ctr">
+        <a:solidFill>
+          <a:schemeClr val="tx1">
+            <a:lumMod val="15000"/>
+            <a:lumOff val="85000"/>
+          </a:schemeClr>
+        </a:solidFill>
+        <a:round/>
+      </a:ln>
+    </cs:spPr>
+    <cs:defRPr sz="900" kern="1200"/>
+  </cs:categoryAxis>
+  <cs:chartArea mods="allowNoFillOverride allowNoLineOverride">
+    <cs:lnRef idx="0"/>
+    <cs:fillRef idx="0"/>
+    <cs:effectRef idx="0"/>
+    <cs:fontRef idx="minor">
+      <a:schemeClr val="tx1"/>
+    </cs:fontRef>
+    <cs:spPr>
+      <a:solidFill>
+        <a:schemeClr val="bg1"/>
+      </a:solidFill>
+      <a:ln w="9525" cap="flat" cmpd="sng" algn="ctr">
+        <a:solidFill>
+          <a:schemeClr val="tx1">
+            <a:lumMod val="15000"/>
+            <a:lumOff val="85000"/>
+          </a:schemeClr>
+        </a:solidFill>
+        <a:round/>
+      </a:ln>
+    </cs:spPr>
+    <cs:defRPr sz="1000" kern="1200"/>
+  </cs:chartArea>
+  <cs:dataLabel>
+    <cs:lnRef idx="0"/>
+    <cs:fillRef idx="0"/>
+    <cs:effectRef idx="0"/>
+    <cs:fontRef idx="minor">
+      <a:schemeClr val="tx1">
+        <a:lumMod val="75000"/>
+        <a:lumOff val="25000"/>
+      </a:schemeClr>
+    </cs:fontRef>
+    <cs:defRPr sz="900" kern="1200"/>
+  </cs:dataLabel>
+  <cs:dataLabelCallout>
+    <cs:lnRef idx="0"/>
+    <cs:fillRef idx="0"/>
+    <cs:effectRef idx="0"/>
+    <cs:fontRef idx="minor">
+      <a:schemeClr val="dk1">
+        <a:lumMod val="65000"/>
+        <a:lumOff val="35000"/>
+      </a:schemeClr>
+    </cs:fontRef>
+    <cs:spPr>
+      <a:solidFill>
+        <a:schemeClr val="lt1"/>
+      </a:solidFill>
+      <a:ln>
+        <a:solidFill>
+          <a:schemeClr val="dk1">
+            <a:lumMod val="25000"/>
+            <a:lumOff val="75000"/>
+          </a:schemeClr>
+        </a:solidFill>
+      </a:ln>
+    </cs:spPr>
+    <cs:defRPr sz="900" kern="1200"/>
+    <cs:bodyPr rot="0" spcFirstLastPara="1" vertOverflow="clip" horzOverflow="clip" vert="horz" wrap="square" lIns="36576" tIns="18288" rIns="36576" bIns="18288" anchor="ctr" anchorCtr="1">
+      <a:spAutoFit/>
+    </cs:bodyPr>
+  </cs:dataLabelCallout>
+  <cs:dataPoint>
+    <cs:lnRef idx="0"/>
+    <cs:fillRef idx="1">
+      <cs:styleClr val="auto"/>
+    </cs:fillRef>
+    <cs:effectRef idx="0"/>
+    <cs:fontRef idx="minor">
+      <a:schemeClr val="tx1"/>
+    </cs:fontRef>
+  </cs:dataPoint>
+  <cs:dataPoint3D>
+    <cs:lnRef idx="0"/>
+    <cs:fillRef idx="1">
+      <cs:styleClr val="auto"/>
+    </cs:fillRef>
+    <cs:effectRef idx="0"/>
+    <cs:fontRef idx="minor">
+      <a:schemeClr val="tx1"/>
+    </cs:fontRef>
+  </cs:dataPoint3D>
+  <cs:dataPointLine>
+    <cs:lnRef idx="0">
+      <cs:styleClr val="auto"/>
+    </cs:lnRef>
+    <cs:fillRef idx="1"/>
+    <cs:effectRef idx="0"/>
+    <cs:fontRef idx="minor">
+      <a:schemeClr val="tx1"/>
+    </cs:fontRef>
+    <cs:spPr>
+      <a:ln w="28575" cap="rnd">
+        <a:solidFill>
+          <a:schemeClr val="phClr"/>
+        </a:solidFill>
+        <a:round/>
+      </a:ln>
+    </cs:spPr>
+  </cs:dataPointLine>
+  <cs:dataPointMarker>
+    <cs:lnRef idx="0">
+      <cs:styleClr val="auto"/>
+    </cs:lnRef>
+    <cs:fillRef idx="1">
+      <cs:styleClr val="auto"/>
+    </cs:fillRef>
+    <cs:effectRef idx="0"/>
+    <cs:fontRef idx="minor">
+      <a:schemeClr val="tx1"/>
+    </cs:fontRef>
+    <cs:spPr>
+      <a:ln w="9525">
+        <a:solidFill>
+          <a:schemeClr val="phClr"/>
+        </a:solidFill>
+      </a:ln>
+    </cs:spPr>
+  </cs:dataPointMarker>
+  <cs:dataPointMarkerLayout symbol="circle" size="5"/>
+  <cs:dataPointWireframe>
+    <cs:lnRef idx="0">
+      <cs:styleClr val="auto"/>
+    </cs:lnRef>
+    <cs:fillRef idx="1"/>
+    <cs:effectRef idx="0"/>
+    <cs:fontRef idx="minor">
+      <a:schemeClr val="tx1"/>
+    </cs:fontRef>
+    <cs:spPr>
+      <a:ln w="9525" cap="rnd">
+        <a:solidFill>
+          <a:schemeClr val="phClr"/>
+        </a:solidFill>
+        <a:round/>
+      </a:ln>
+    </cs:spPr>
+  </cs:dataPointWireframe>
+  <cs:dataTable>
+    <cs:lnRef idx="0"/>
+    <cs:fillRef idx="0"/>
+    <cs:effectRef idx="0"/>
+    <cs:fontRef idx="minor">
+      <a:schemeClr val="tx1">
+        <a:lumMod val="65000"/>
+        <a:lumOff val="35000"/>
+      </a:schemeClr>
+    </cs:fontRef>
+    <cs:spPr>
+      <a:noFill/>
+      <a:ln w="9525" cap="flat" cmpd="sng" algn="ctr">
+        <a:solidFill>
+          <a:schemeClr val="tx1">
+            <a:lumMod val="15000"/>
+            <a:lumOff val="85000"/>
+          </a:schemeClr>
+        </a:solidFill>
+        <a:round/>
+      </a:ln>
+    </cs:spPr>
+    <cs:defRPr sz="900" kern="1200"/>
+  </cs:dataTable>
+  <cs:downBar>
+    <cs:lnRef idx="0"/>
+    <cs:fillRef idx="0"/>
+    <cs:effectRef idx="0"/>
+    <cs:fontRef idx="minor">
+      <a:schemeClr val="dk1"/>
+    </cs:fontRef>
+    <cs:spPr>
+      <a:solidFill>
+        <a:schemeClr val="dk1">
+          <a:lumMod val="65000"/>
+          <a:lumOff val="35000"/>
+        </a:schemeClr>
+      </a:solidFill>
+      <a:ln w="9525">
+        <a:solidFill>
+          <a:schemeClr val="tx1">
+            <a:lumMod val="65000"/>
+            <a:lumOff val="35000"/>
+          </a:schemeClr>
+        </a:solidFill>
+      </a:ln>
+    </cs:spPr>
+  </cs:downBar>
+  <cs:dropLine>
+    <cs:lnRef idx="0"/>
+    <cs:fillRef idx="0"/>
+    <cs:effectRef idx="0"/>
+    <cs:fontRef idx="minor">
+      <a:schemeClr val="tx1"/>
+    </cs:fontRef>
+    <cs:spPr>
+      <a:ln w="9525" cap="flat" cmpd="sng" algn="ctr">
+        <a:solidFill>
+          <a:schemeClr val="tx1">
+            <a:lumMod val="35000"/>
+            <a:lumOff val="65000"/>
+          </a:schemeClr>
+        </a:solidFill>
+        <a:round/>
+      </a:ln>
+    </cs:spPr>
+  </cs:dropLine>
+  <cs:errorBar>
+    <cs:lnRef idx="0"/>
+    <cs:fillRef idx="0"/>
+    <cs:effectRef idx="0"/>
+    <cs:fontRef idx="minor">
+      <a:schemeClr val="tx1"/>
+    </cs:fontRef>
+    <cs:spPr>
+      <a:ln w="9525" cap="flat" cmpd="sng" algn="ctr">
+        <a:solidFill>
+          <a:schemeClr val="tx1">
+            <a:lumMod val="65000"/>
+            <a:lumOff val="35000"/>
+          </a:schemeClr>
+        </a:solidFill>
+        <a:round/>
+      </a:ln>
+    </cs:spPr>
+  </cs:errorBar>
+  <cs:floor>
+    <cs:lnRef idx="0"/>
+    <cs:fillRef idx="0"/>
+    <cs:effectRef idx="0"/>
+    <cs:fontRef idx="minor">
+      <a:schemeClr val="tx1"/>
+    </cs:fontRef>
+    <cs:spPr>
+      <a:noFill/>
+      <a:ln>
+        <a:noFill/>
+      </a:ln>
+    </cs:spPr>
+  </cs:floor>
+  <cs:gridlineMajor>
+    <cs:lnRef idx="0"/>
+    <cs:fillRef idx="0"/>
+    <cs:effectRef idx="0"/>
+    <cs:fontRef idx="minor">
+      <a:schemeClr val="tx1"/>
+    </cs:fontRef>
+    <cs:spPr>
+      <a:ln w="9525" cap="flat" cmpd="sng" algn="ctr">
+        <a:solidFill>
+          <a:schemeClr val="tx1">
+            <a:lumMod val="15000"/>
+            <a:lumOff val="85000"/>
+          </a:schemeClr>
+        </a:solidFill>
+        <a:round/>
+      </a:ln>
+    </cs:spPr>
+  </cs:gridlineMajor>
+  <cs:gridlineMinor>
+    <cs:lnRef idx="0"/>
+    <cs:fillRef idx="0"/>
+    <cs:effectRef idx="0"/>
+    <cs:fontRef idx="minor">
+      <a:schemeClr val="tx1"/>
+    </cs:fontRef>
+    <cs:spPr>
+      <a:ln w="9525" cap="flat" cmpd="sng" algn="ctr">
+        <a:solidFill>
+          <a:schemeClr val="tx1">
+            <a:lumMod val="5000"/>
+            <a:lumOff val="95000"/>
+          </a:schemeClr>
+        </a:solidFill>
+        <a:round/>
+      </a:ln>
+    </cs:spPr>
+  </cs:gridlineMinor>
+  <cs:hiLoLine>
+    <cs:lnRef idx="0"/>
+    <cs:fillRef idx="0"/>
+    <cs:effectRef idx="0"/>
+    <cs:fontRef idx="minor">
+      <a:schemeClr val="tx1"/>
+    </cs:fontRef>
+    <cs:spPr>
+      <a:ln w="9525" cap="flat" cmpd="sng" algn="ctr">
+        <a:solidFill>
+          <a:schemeClr val="tx1">
+            <a:lumMod val="75000"/>
+            <a:lumOff val="25000"/>
+          </a:schemeClr>
+        </a:solidFill>
+        <a:round/>
+      </a:ln>
+    </cs:spPr>
+  </cs:hiLoLine>
+  <cs:leaderLine>
+    <cs:lnRef idx="0"/>
+    <cs:fillRef idx="0"/>
+    <cs:effectRef idx="0"/>
+    <cs:fontRef idx="minor">
+      <a:schemeClr val="tx1"/>
+    </cs:fontRef>
+    <cs:spPr>
+      <a:ln w="9525" cap="flat" cmpd="sng" algn="ctr">
+        <a:solidFill>
+          <a:schemeClr val="tx1">
+            <a:lumMod val="35000"/>
+            <a:lumOff val="65000"/>
+          </a:schemeClr>
+        </a:solidFill>
+        <a:round/>
+      </a:ln>
+    </cs:spPr>
+  </cs:leaderLine>
+  <cs:legend>
+    <cs:lnRef idx="0"/>
+    <cs:fillRef idx="0"/>
+    <cs:effectRef idx="0"/>
+    <cs:fontRef idx="minor">
+      <a:schemeClr val="tx1">
+        <a:lumMod val="65000"/>
+        <a:lumOff val="35000"/>
+      </a:schemeClr>
+    </cs:fontRef>
+    <cs:defRPr sz="900" kern="1200"/>
+  </cs:legend>
+  <cs:plotArea mods="allowNoFillOverride allowNoLineOverride">
+    <cs:lnRef idx="0"/>
+    <cs:fillRef idx="0"/>
+    <cs:effectRef idx="0"/>
+    <cs:fontRef idx="minor">
+      <a:schemeClr val="tx1"/>
+    </cs:fontRef>
+  </cs:plotArea>
+  <cs:plotArea3D mods="allowNoFillOverride allowNoLineOverride">
+    <cs:lnRef idx="0"/>
+    <cs:fillRef idx="0"/>
+    <cs:effectRef idx="0"/>
+    <cs:fontRef idx="minor">
+      <a:schemeClr val="tx1"/>
+    </cs:fontRef>
+  </cs:plotArea3D>
+  <cs:seriesAxis>
+    <cs:lnRef idx="0"/>
+    <cs:fillRef idx="0"/>
+    <cs:effectRef idx="0"/>
+    <cs:fontRef idx="minor">
+      <a:schemeClr val="tx1">
+        <a:lumMod val="65000"/>
+        <a:lumOff val="35000"/>
+      </a:schemeClr>
+    </cs:fontRef>
+    <cs:defRPr sz="900" kern="1200"/>
+  </cs:seriesAxis>
+  <cs:seriesLine>
+    <cs:lnRef idx="0"/>
+    <cs:fillRef idx="0"/>
+    <cs:effectRef idx="0"/>
+    <cs:fontRef idx="minor">
+      <a:schemeClr val="tx1"/>
+    </cs:fontRef>
+    <cs:spPr>
+      <a:ln w="9525" cap="flat" cmpd="sng" algn="ctr">
+        <a:solidFill>
+          <a:schemeClr val="tx1">
+            <a:lumMod val="35000"/>
+            <a:lumOff val="65000"/>
+          </a:schemeClr>
+        </a:solidFill>
+        <a:round/>
+      </a:ln>
+    </cs:spPr>
+  </cs:seriesLine>
+  <cs:title>
+    <cs:lnRef idx="0"/>
+    <cs:fillRef idx="0"/>
+    <cs:effectRef idx="0"/>
+    <cs:fontRef idx="minor">
+      <a:schemeClr val="tx1">
+        <a:lumMod val="65000"/>
+        <a:lumOff val="35000"/>
+      </a:schemeClr>
+    </cs:fontRef>
+    <cs:defRPr sz="1400" b="0" kern="1200" spc="0" baseline="0"/>
+  </cs:title>
+  <cs:trendline>
+    <cs:lnRef idx="0">
+      <cs:styleClr val="auto"/>
+    </cs:lnRef>
+    <cs:fillRef idx="0"/>
+    <cs:effectRef idx="0"/>
+    <cs:fontRef idx="minor">
+      <a:schemeClr val="tx1"/>
+    </cs:fontRef>
+    <cs:spPr>
+      <a:ln w="19050" cap="rnd">
+        <a:solidFill>
+          <a:schemeClr val="phClr"/>
+        </a:solidFill>
+        <a:prstDash val="sysDot"/>
+      </a:ln>
+    </cs:spPr>
+  </cs:trendline>
+  <cs:trendlineLabel>
+    <cs:lnRef idx="0"/>
+    <cs:fillRef idx="0"/>
+    <cs:effectRef idx="0"/>
+    <cs:fontRef idx="minor">
+      <a:schemeClr val="tx1">
+        <a:lumMod val="65000"/>
+        <a:lumOff val="35000"/>
+      </a:schemeClr>
+    </cs:fontRef>
+    <cs:defRPr sz="900" kern="1200"/>
+  </cs:trendlineLabel>
+  <cs:upBar>
+    <cs:lnRef idx="0"/>
+    <cs:fillRef idx="0"/>
+    <cs:effectRef idx="0"/>
+    <cs:fontRef idx="minor">
+      <a:schemeClr val="dk1"/>
+    </cs:fontRef>
+    <cs:spPr>
+      <a:solidFill>
+        <a:schemeClr val="lt1"/>
+      </a:solidFill>
+      <a:ln w="9525">
+        <a:solidFill>
+          <a:schemeClr val="tx1">
+            <a:lumMod val="15000"/>
+            <a:lumOff val="85000"/>
+          </a:schemeClr>
+        </a:solidFill>
+      </a:ln>
+    </cs:spPr>
+  </cs:upBar>
+  <cs:valueAxis>
+    <cs:lnRef idx="0"/>
+    <cs:fillRef idx="0"/>
+    <cs:effectRef idx="0"/>
+    <cs:fontRef idx="minor">
+      <a:schemeClr val="tx1">
+        <a:lumMod val="65000"/>
+        <a:lumOff val="35000"/>
+      </a:schemeClr>
+    </cs:fontRef>
+    <cs:defRPr sz="900" kern="1200"/>
+  </cs:valueAxis>
+  <cs:wall>
+    <cs:lnRef idx="0"/>
+    <cs:fillRef idx="0"/>
+    <cs:effectRef idx="0"/>
+    <cs:fontRef idx="minor">
+      <a:schemeClr val="tx1"/>
+    </cs:fontRef>
+    <cs:spPr>
+      <a:noFill/>
+      <a:ln>
+        <a:noFill/>
+      </a:ln>
+    </cs:spPr>
+  </cs:wall>
+</cs:chartStyle>
+</file>
+
 <file path=word/theme/theme1.xml><?xml version="1.0" encoding="utf-8"?>
 <a:theme xmlns:a="http://schemas.openxmlformats.org/drawingml/2006/main" name="Тема Office">
   <a:themeElements>

</xml_diff>